<commit_message>
Align rollout plan with the actual Zubchek system
Reworks the plan against what the codebase actually implements: Z-Index
scoring over the 12 anterior teeth from a disclosing-dye photo, the
doctor/patient accounts flow, shared report links and report email, and
the move off the Atoms platform onto own infrastructure.

Adds activities that the method requires and the first draft missed:
photo protocol, disclosing-agent supplies, backup/restore, and a clinical
validation step comparing the Z-Index against the dentist's own
assessment. 20 activities total; responsibilities stay role-based.

Co-Authored-By: Claude Opus 5 <noreply@anthropic.com>
Claude-Session: https://claude.ai/code/session_018TNgATvPkkFHMjJPTVQc22
</commit_message>
<xml_diff>
--- a/docs/План внедрения проекта Zubchek.docx
+++ b/docs/План внедрения проекта Zubchek.docx
@@ -153,7 +153,7 @@
           <w:b/>
           <w:bCs/>
         </w:rPr>
-        <w:t xml:space="preserve">внедрения проекта «Zubchek» — цифровой оценки гигиены полости рта по фотографии</w:t>
+        <w:t xml:space="preserve">внедрения проекта «Zubchek» — цифровой оценки гигиены полости рта по фотографии (индекс Z)</w:t>
       </w:r>
     </w:p>
     <w:p>
@@ -180,7 +180,7 @@
           <w:sz w:val="28"/>
           <w:szCs w:val="28"/>
         </w:rPr>
-        <w:t xml:space="preserve">ввод сервиса ЦОГ в промышленную эксплуатацию и выполнение не менее 100 исследований гигиены полости рта к моменту окончания плана.</w:t>
+        <w:t xml:space="preserve">ввод сервиса ЦОГ в промышленную эксплуатацию и выполнение не менее 100 исследований гигиены полости рта по индексу Z к моменту окончания плана.</w:t>
       </w:r>
     </w:p>
     <w:p>
@@ -234,7 +234,7 @@
           <w:sz w:val="28"/>
           <w:szCs w:val="28"/>
         </w:rPr>
-        <w:t xml:space="preserve">в пределах утвержденного бюджета службы ИТ (инфраструктура и оплата ИИ-провайдера).</w:t>
+        <w:t xml:space="preserve">инфраструктура и оплата ИИ-провайдера по факту потребления — в пределах бюджета службы ИТ; расходные материалы (индикаторы налета) — в пределах бюджета отделения стоматологии.</w:t>
       </w:r>
     </w:p>
     <w:tbl>
@@ -482,7 +482,7 @@
                 <w:sz w:val="24"/>
                 <w:szCs w:val="24"/>
               </w:rPr>
-              <w:t xml:space="preserve">Утвердить функциональные требования и границы пилотного внедрения сервиса «Zubchek» — цифровой оценки гигиены полости рта по фотографии (далее — ЦОГ): перечень подразделений, категории пациентов, состав отчета для врача</w:t>
+              <w:t xml:space="preserve">Утвердить функциональные требования и границы пилотного внедрения сервиса «Zubchek» — цифровой оценки гигиены полости рта по индексу Z (далее — ЦОГ): перечень подразделений, категории пациентов, состав отчета для врача и для пациента</w:t>
             </w:r>
           </w:p>
         </w:tc>
@@ -614,7 +614,7 @@
                 <w:sz w:val="24"/>
                 <w:szCs w:val="24"/>
               </w:rPr>
-              <w:t xml:space="preserve">Развернуть продуктивную инфраструктуру сервиса (сервер приложения, база данных, подключение ИИ-провайдера), настроить домены и SSL-сертификаты</w:t>
+              <w:t xml:space="preserve">Завершить перенос сервиса на собственную инфраструктуру: сервер приложения, база данных PostgreSQL, подключение ИИ-провайдера (vision-модель), домены app.zubchek.com и api.zubchek.com, SSL-сертификаты</w:t>
             </w:r>
           </w:p>
         </w:tc>
@@ -746,7 +746,7 @@
                 <w:sz w:val="24"/>
                 <w:szCs w:val="24"/>
               </w:rPr>
-              <w:t xml:space="preserve">Провести оценку соответствия обработки персональных данных и медицинских фотоизображений требованиям Федерального закона № 152-ФЗ, подготовить и утвердить форму информированного согласия пациента</w:t>
+              <w:t xml:space="preserve">Настроить резервное копирование базы данных и фотоизображений, утвердить регламент восстановления, обеспечить мониторинг доступности сервиса</w:t>
             </w:r>
           </w:p>
         </w:tc>
@@ -798,7 +798,7 @@
                 <w:sz w:val="24"/>
                 <w:szCs w:val="24"/>
               </w:rPr>
-              <w:t xml:space="preserve">Юридическая служба</w:t>
+              <w:t xml:space="preserve">Служба ИТ</w:t>
             </w:r>
           </w:p>
         </w:tc>
@@ -878,7 +878,7 @@
                 <w:sz w:val="24"/>
                 <w:szCs w:val="24"/>
               </w:rPr>
-              <w:t xml:space="preserve">Провести функциональное и нагрузочное тестирование сервиса, устранить выявленные замечания, обеспечить резервное копирование данных</w:t>
+              <w:t xml:space="preserve">Провести оценку соответствия обработки персональных данных и медицинских фотоизображений требованиям Федерального закона № 152-ФЗ, подготовить и утвердить форму информированного согласия пациента на фотофиксацию и автоматизированный анализ</w:t>
             </w:r>
           </w:p>
         </w:tc>
@@ -904,7 +904,7 @@
                 <w:sz w:val="24"/>
                 <w:szCs w:val="24"/>
               </w:rPr>
-              <w:t xml:space="preserve">02.10.2026</w:t>
+              <w:t xml:space="preserve">25.09.2026</w:t>
             </w:r>
           </w:p>
         </w:tc>
@@ -930,7 +930,7 @@
                 <w:sz w:val="24"/>
                 <w:szCs w:val="24"/>
               </w:rPr>
-              <w:t xml:space="preserve">Служба ИТ</w:t>
+              <w:t xml:space="preserve">Юридическая служба</w:t>
             </w:r>
           </w:p>
         </w:tc>
@@ -1010,7 +1010,7 @@
                 <w:sz w:val="24"/>
                 <w:szCs w:val="24"/>
               </w:rPr>
-              <w:t xml:space="preserve">Направить в финансово-экономическую службу данные для определения возможности оказания услуги ЦОГ в ОМС/ДМС, а также для расчета стоимости услуги</w:t>
+              <w:t xml:space="preserve">Провести функциональное и нагрузочное тестирование сервиса по сценариям «врач», «пациент», «отчет по ссылке», «отправка отчета на почту пациента»; устранить выявленные замечания</w:t>
             </w:r>
           </w:p>
         </w:tc>
@@ -1036,7 +1036,7 @@
                 <w:sz w:val="24"/>
                 <w:szCs w:val="24"/>
               </w:rPr>
-              <w:t xml:space="preserve">09.10.2026</w:t>
+              <w:t xml:space="preserve">02.10.2026</w:t>
             </w:r>
           </w:p>
         </w:tc>
@@ -1062,33 +1062,33 @@
                 <w:sz w:val="24"/>
                 <w:szCs w:val="24"/>
               </w:rPr>
+              <w:t xml:space="preserve">Служба ИТ</w:t>
+            </w:r>
+          </w:p>
+        </w:tc>
+        <w:tc>
+          <w:tcPr>
+            <w:tcW w:type="dxa" w:w="1755"/>
+            <w:tcMar>
+              <w:top w:type="dxa" w:w="60"/>
+              <w:left w:type="dxa" w:w="80"/>
+              <w:bottom w:type="dxa" w:w="60"/>
+              <w:right w:type="dxa" w:w="80"/>
+            </w:tcMar>
+            <w:vAlign w:val="center"/>
+          </w:tcPr>
+          <w:p>
+            <w:pPr>
+              <w:spacing w:after="0" w:line="240"/>
+              <w:jc w:val="center"/>
+            </w:pPr>
+            <w:r>
+              <w:rPr>
+                <w:rFonts w:ascii="Times New Roman" w:cs="Times New Roman" w:eastAsia="Times New Roman" w:hAnsi="Times New Roman"/>
+                <w:sz w:val="24"/>
+                <w:szCs w:val="24"/>
+              </w:rPr>
               <w:t xml:space="preserve">Руководитель проекта</w:t>
-            </w:r>
-          </w:p>
-        </w:tc>
-        <w:tc>
-          <w:tcPr>
-            <w:tcW w:type="dxa" w:w="1755"/>
-            <w:tcMar>
-              <w:top w:type="dxa" w:w="60"/>
-              <w:left w:type="dxa" w:w="80"/>
-              <w:bottom w:type="dxa" w:w="60"/>
-              <w:right w:type="dxa" w:w="80"/>
-            </w:tcMar>
-            <w:vAlign w:val="center"/>
-          </w:tcPr>
-          <w:p>
-            <w:pPr>
-              <w:spacing w:after="0" w:line="240"/>
-              <w:jc w:val="center"/>
-            </w:pPr>
-            <w:r>
-              <w:rPr>
-                <w:rFonts w:ascii="Times New Roman" w:cs="Times New Roman" w:eastAsia="Times New Roman" w:hAnsi="Times New Roman"/>
-                <w:sz w:val="24"/>
-                <w:szCs w:val="24"/>
-              </w:rPr>
-              <w:t xml:space="preserve">Финансово-экономическая служба</w:t>
             </w:r>
           </w:p>
         </w:tc>
@@ -1142,7 +1142,7 @@
                 <w:sz w:val="24"/>
                 <w:szCs w:val="24"/>
               </w:rPr>
-              <w:t xml:space="preserve">Дать заключение о возможности оказания услуги ЦОГ в ОМС/ДМС</w:t>
+              <w:t xml:space="preserve">Утвердить фотопротокол исследования: нанесение индикатора налета, положение 12 фронтальных зубов в сомкнутом положении, требования к освещению и использованию ретрактора</w:t>
             </w:r>
           </w:p>
         </w:tc>
@@ -1168,7 +1168,7 @@
                 <w:sz w:val="24"/>
                 <w:szCs w:val="24"/>
               </w:rPr>
-              <w:t xml:space="preserve">16.10.2026</w:t>
+              <w:t xml:space="preserve">02.10.2026</w:t>
             </w:r>
           </w:p>
         </w:tc>
@@ -1194,7 +1194,7 @@
                 <w:sz w:val="24"/>
                 <w:szCs w:val="24"/>
               </w:rPr>
-              <w:t xml:space="preserve">Финансово-экономическая служба</w:t>
+              <w:t xml:space="preserve">Заведующий отделением стоматологии</w:t>
             </w:r>
           </w:p>
         </w:tc>
@@ -1274,7 +1274,7 @@
                 <w:sz w:val="24"/>
                 <w:szCs w:val="24"/>
               </w:rPr>
-              <w:t xml:space="preserve">Внести услугу ЦОГ в прейскурант клиники</w:t>
+              <w:t xml:space="preserve">Обеспечить подразделения расходными материалами для проведения ЦОГ (индикаторы налета, ретракторы, средства фотофиксации)</w:t>
             </w:r>
           </w:p>
         </w:tc>
@@ -1300,7 +1300,7 @@
                 <w:sz w:val="24"/>
                 <w:szCs w:val="24"/>
               </w:rPr>
-              <w:t xml:space="preserve">23.10.2026</w:t>
+              <w:t xml:space="preserve">09.10.2026</w:t>
             </w:r>
           </w:p>
         </w:tc>
@@ -1326,7 +1326,7 @@
                 <w:sz w:val="24"/>
                 <w:szCs w:val="24"/>
               </w:rPr>
-              <w:t xml:space="preserve">Финансово-экономическая служба</w:t>
+              <w:t xml:space="preserve">Служба снабжения</w:t>
             </w:r>
           </w:p>
         </w:tc>
@@ -1352,7 +1352,7 @@
                 <w:sz w:val="24"/>
                 <w:szCs w:val="24"/>
               </w:rPr>
-              <w:t xml:space="preserve">Руководитель проекта</w:t>
+              <w:t xml:space="preserve">Заведующий отделением стоматологии</w:t>
             </w:r>
           </w:p>
         </w:tc>
@@ -1406,7 +1406,7 @@
                 <w:sz w:val="24"/>
                 <w:szCs w:val="24"/>
               </w:rPr>
-              <w:t xml:space="preserve">Разработать и утвердить регламент работы врача с сервисом: маршрут пациента, порядок фотопротокола, интерпретация индексов гигиены, оформление результата в медицинской информационной системе</w:t>
+              <w:t xml:space="preserve">Направить в финансово-экономическую службу данные для определения возможности оказания услуги ЦОГ в ОМС/ДМС, а также для расчета стоимости услуги с учетом стоимости ИИ-обработки одного исследования</w:t>
             </w:r>
           </w:p>
         </w:tc>
@@ -1432,7 +1432,7 @@
                 <w:sz w:val="24"/>
                 <w:szCs w:val="24"/>
               </w:rPr>
-              <w:t xml:space="preserve">23.10.2026</w:t>
+              <w:t xml:space="preserve">09.10.2026</w:t>
             </w:r>
           </w:p>
         </w:tc>
@@ -1458,7 +1458,7 @@
                 <w:sz w:val="24"/>
                 <w:szCs w:val="24"/>
               </w:rPr>
-              <w:t xml:space="preserve">Заведующий отделением стоматологии</w:t>
+              <w:t xml:space="preserve">Руководитель проекта</w:t>
             </w:r>
           </w:p>
         </w:tc>
@@ -1484,7 +1484,7 @@
                 <w:sz w:val="24"/>
                 <w:szCs w:val="24"/>
               </w:rPr>
-              <w:t xml:space="preserve">Руководитель проекта</w:t>
+              <w:t xml:space="preserve">Финансово-экономическая служба</w:t>
             </w:r>
           </w:p>
         </w:tc>
@@ -1538,7 +1538,7 @@
                 <w:sz w:val="24"/>
                 <w:szCs w:val="24"/>
               </w:rPr>
-              <w:t xml:space="preserve">Провести обучение врачей-стоматологов и медицинских сестер работе с сервисом ЦОГ</w:t>
+              <w:t xml:space="preserve">Дать заключение о возможности оказания услуги ЦОГ в ОМС/ДМС</w:t>
             </w:r>
           </w:p>
         </w:tc>
@@ -1564,7 +1564,7 @@
                 <w:sz w:val="24"/>
                 <w:szCs w:val="24"/>
               </w:rPr>
-              <w:t xml:space="preserve">30.10.2026</w:t>
+              <w:t xml:space="preserve">16.10.2026</w:t>
             </w:r>
           </w:p>
         </w:tc>
@@ -1590,33 +1590,33 @@
                 <w:sz w:val="24"/>
                 <w:szCs w:val="24"/>
               </w:rPr>
+              <w:t xml:space="preserve">Финансово-экономическая служба</w:t>
+            </w:r>
+          </w:p>
+        </w:tc>
+        <w:tc>
+          <w:tcPr>
+            <w:tcW w:type="dxa" w:w="1755"/>
+            <w:tcMar>
+              <w:top w:type="dxa" w:w="60"/>
+              <w:left w:type="dxa" w:w="80"/>
+              <w:bottom w:type="dxa" w:w="60"/>
+              <w:right w:type="dxa" w:w="80"/>
+            </w:tcMar>
+            <w:vAlign w:val="center"/>
+          </w:tcPr>
+          <w:p>
+            <w:pPr>
+              <w:spacing w:after="0" w:line="240"/>
+              <w:jc w:val="center"/>
+            </w:pPr>
+            <w:r>
+              <w:rPr>
+                <w:rFonts w:ascii="Times New Roman" w:cs="Times New Roman" w:eastAsia="Times New Roman" w:hAnsi="Times New Roman"/>
+                <w:sz w:val="24"/>
+                <w:szCs w:val="24"/>
+              </w:rPr>
               <w:t xml:space="preserve">Руководитель проекта</w:t>
-            </w:r>
-          </w:p>
-        </w:tc>
-        <w:tc>
-          <w:tcPr>
-            <w:tcW w:type="dxa" w:w="1755"/>
-            <w:tcMar>
-              <w:top w:type="dxa" w:w="60"/>
-              <w:left w:type="dxa" w:w="80"/>
-              <w:bottom w:type="dxa" w:w="60"/>
-              <w:right w:type="dxa" w:w="80"/>
-            </w:tcMar>
-            <w:vAlign w:val="center"/>
-          </w:tcPr>
-          <w:p>
-            <w:pPr>
-              <w:spacing w:after="0" w:line="240"/>
-              <w:jc w:val="center"/>
-            </w:pPr>
-            <w:r>
-              <w:rPr>
-                <w:rFonts w:ascii="Times New Roman" w:cs="Times New Roman" w:eastAsia="Times New Roman" w:hAnsi="Times New Roman"/>
-                <w:sz w:val="24"/>
-                <w:szCs w:val="24"/>
-              </w:rPr>
-              <w:t xml:space="preserve">Заведующий отделением стоматологии</w:t>
             </w:r>
           </w:p>
         </w:tc>
@@ -1670,7 +1670,7 @@
                 <w:sz w:val="24"/>
                 <w:szCs w:val="24"/>
               </w:rPr>
-              <w:t xml:space="preserve">Провести пилотную эксплуатацию сервиса (не менее 30 пациентов), собрать обратную связь врачей и пациентов, устранить замечания</w:t>
+              <w:t xml:space="preserve">Внести услугу ЦОГ в прейскурант клиники</w:t>
             </w:r>
           </w:p>
         </w:tc>
@@ -1696,7 +1696,7 @@
                 <w:sz w:val="24"/>
                 <w:szCs w:val="24"/>
               </w:rPr>
-              <w:t xml:space="preserve">27.11.2026</w:t>
+              <w:t xml:space="preserve">23.10.2026</w:t>
             </w:r>
           </w:p>
         </w:tc>
@@ -1722,7 +1722,7 @@
                 <w:sz w:val="24"/>
                 <w:szCs w:val="24"/>
               </w:rPr>
-              <w:t xml:space="preserve">Заведующий отделением стоматологии</w:t>
+              <w:t xml:space="preserve">Финансово-экономическая служба</w:t>
             </w:r>
           </w:p>
         </w:tc>
@@ -1802,7 +1802,7 @@
                 <w:sz w:val="24"/>
                 <w:szCs w:val="24"/>
               </w:rPr>
-              <w:t xml:space="preserve">Направить в службу маркетинга формы для создания страницы на сайте</w:t>
+              <w:t xml:space="preserve">Разработать и утвердить регламент работы врача с сервисом: маршрут пациента, регистрация пациента и выдача доступа в личный кабинет, интерпретация индекса Z и рекомендаций, оформление результата в медицинской информационной системе</w:t>
             </w:r>
           </w:p>
         </w:tc>
@@ -1828,7 +1828,7 @@
                 <w:sz w:val="24"/>
                 <w:szCs w:val="24"/>
               </w:rPr>
-              <w:t xml:space="preserve">30.10.2026</w:t>
+              <w:t xml:space="preserve">23.10.2026</w:t>
             </w:r>
           </w:p>
         </w:tc>
@@ -1854,33 +1854,33 @@
                 <w:sz w:val="24"/>
                 <w:szCs w:val="24"/>
               </w:rPr>
+              <w:t xml:space="preserve">Заведующий отделением стоматологии</w:t>
+            </w:r>
+          </w:p>
+        </w:tc>
+        <w:tc>
+          <w:tcPr>
+            <w:tcW w:type="dxa" w:w="1755"/>
+            <w:tcMar>
+              <w:top w:type="dxa" w:w="60"/>
+              <w:left w:type="dxa" w:w="80"/>
+              <w:bottom w:type="dxa" w:w="60"/>
+              <w:right w:type="dxa" w:w="80"/>
+            </w:tcMar>
+            <w:vAlign w:val="center"/>
+          </w:tcPr>
+          <w:p>
+            <w:pPr>
+              <w:spacing w:after="0" w:line="240"/>
+              <w:jc w:val="center"/>
+            </w:pPr>
+            <w:r>
+              <w:rPr>
+                <w:rFonts w:ascii="Times New Roman" w:cs="Times New Roman" w:eastAsia="Times New Roman" w:hAnsi="Times New Roman"/>
+                <w:sz w:val="24"/>
+                <w:szCs w:val="24"/>
+              </w:rPr>
               <w:t xml:space="preserve">Руководитель проекта</w:t>
-            </w:r>
-          </w:p>
-        </w:tc>
-        <w:tc>
-          <w:tcPr>
-            <w:tcW w:type="dxa" w:w="1755"/>
-            <w:tcMar>
-              <w:top w:type="dxa" w:w="60"/>
-              <w:left w:type="dxa" w:w="80"/>
-              <w:bottom w:type="dxa" w:w="60"/>
-              <w:right w:type="dxa" w:w="80"/>
-            </w:tcMar>
-            <w:vAlign w:val="center"/>
-          </w:tcPr>
-          <w:p>
-            <w:pPr>
-              <w:spacing w:after="0" w:line="240"/>
-              <w:jc w:val="center"/>
-            </w:pPr>
-            <w:r>
-              <w:rPr>
-                <w:rFonts w:ascii="Times New Roman" w:cs="Times New Roman" w:eastAsia="Times New Roman" w:hAnsi="Times New Roman"/>
-                <w:sz w:val="24"/>
-                <w:szCs w:val="24"/>
-              </w:rPr>
-              <w:t xml:space="preserve">Служба маркетинга</w:t>
             </w:r>
           </w:p>
         </w:tc>
@@ -1934,7 +1934,7 @@
                 <w:sz w:val="24"/>
                 <w:szCs w:val="24"/>
               </w:rPr>
-              <w:t xml:space="preserve">Сделать на сайте страницу с информированием о возможности прохождения ЦОГ в клинике</w:t>
+              <w:t xml:space="preserve">Провести обучение врачей-стоматологов и гигиенистов работе с сервисом ЦОГ</w:t>
             </w:r>
           </w:p>
         </w:tc>
@@ -1960,7 +1960,7 @@
                 <w:sz w:val="24"/>
                 <w:szCs w:val="24"/>
               </w:rPr>
-              <w:t xml:space="preserve">20.11.2026</w:t>
+              <w:t xml:space="preserve">30.10.2026</w:t>
             </w:r>
           </w:p>
         </w:tc>
@@ -1986,7 +1986,7 @@
                 <w:sz w:val="24"/>
                 <w:szCs w:val="24"/>
               </w:rPr>
-              <w:t xml:space="preserve">Служба маркетинга</w:t>
+              <w:t xml:space="preserve">Руководитель проекта</w:t>
             </w:r>
           </w:p>
         </w:tc>
@@ -2012,7 +2012,7 @@
                 <w:sz w:val="24"/>
                 <w:szCs w:val="24"/>
               </w:rPr>
-              <w:t xml:space="preserve">Руководитель проекта</w:t>
+              <w:t xml:space="preserve">Заведующий отделением стоматологии</w:t>
             </w:r>
           </w:p>
         </w:tc>
@@ -2066,7 +2066,7 @@
                 <w:sz w:val="24"/>
                 <w:szCs w:val="24"/>
               </w:rPr>
-              <w:t xml:space="preserve">Направить в отдел продвижения услуг презентацию о возможности прохождения ЦОГ в клинике</w:t>
+              <w:t xml:space="preserve">Направить в службу маркетинга формы для создания страницы на сайте</w:t>
             </w:r>
           </w:p>
         </w:tc>
@@ -2092,7 +2092,7 @@
                 <w:sz w:val="24"/>
                 <w:szCs w:val="24"/>
               </w:rPr>
-              <w:t xml:space="preserve">06.11.2026</w:t>
+              <w:t xml:space="preserve">30.10.2026</w:t>
             </w:r>
           </w:p>
         </w:tc>
@@ -2144,7 +2144,7 @@
                 <w:sz w:val="24"/>
                 <w:szCs w:val="24"/>
               </w:rPr>
-              <w:t xml:space="preserve">Отдел продвижения услуг</w:t>
+              <w:t xml:space="preserve">Служба маркетинга</w:t>
             </w:r>
           </w:p>
         </w:tc>
@@ -2198,7 +2198,7 @@
                 <w:sz w:val="24"/>
                 <w:szCs w:val="24"/>
               </w:rPr>
-              <w:t xml:space="preserve">Направить в службу клиентского сервиса презентацию о возможности прохождения ЦОГ в клинике</w:t>
+              <w:t xml:space="preserve">Направить в отдел продвижения услуг презентацию о возможности прохождения ЦОГ в клинике</w:t>
             </w:r>
           </w:p>
         </w:tc>
@@ -2276,7 +2276,7 @@
                 <w:sz w:val="24"/>
                 <w:szCs w:val="24"/>
               </w:rPr>
-              <w:t xml:space="preserve">Служба клиентского сервиса</w:t>
+              <w:t xml:space="preserve">Отдел продвижения услуг</w:t>
             </w:r>
           </w:p>
         </w:tc>
@@ -2330,7 +2330,7 @@
                 <w:sz w:val="24"/>
                 <w:szCs w:val="24"/>
               </w:rPr>
-              <w:t xml:space="preserve">Подготовить скрипт о возможности прохождения ЦОГ в клинике</w:t>
+              <w:t xml:space="preserve">Направить в службу клиентского сервиса презентацию о возможности прохождения ЦОГ в клинике</w:t>
             </w:r>
           </w:p>
         </w:tc>
@@ -2356,7 +2356,7 @@
                 <w:sz w:val="24"/>
                 <w:szCs w:val="24"/>
               </w:rPr>
-              <w:t xml:space="preserve">13.11.2026</w:t>
+              <w:t xml:space="preserve">06.11.2026</w:t>
             </w:r>
           </w:p>
         </w:tc>
@@ -2382,33 +2382,33 @@
                 <w:sz w:val="24"/>
                 <w:szCs w:val="24"/>
               </w:rPr>
+              <w:t xml:space="preserve">Руководитель проекта</w:t>
+            </w:r>
+          </w:p>
+        </w:tc>
+        <w:tc>
+          <w:tcPr>
+            <w:tcW w:type="dxa" w:w="1755"/>
+            <w:tcMar>
+              <w:top w:type="dxa" w:w="60"/>
+              <w:left w:type="dxa" w:w="80"/>
+              <w:bottom w:type="dxa" w:w="60"/>
+              <w:right w:type="dxa" w:w="80"/>
+            </w:tcMar>
+            <w:vAlign w:val="center"/>
+          </w:tcPr>
+          <w:p>
+            <w:pPr>
+              <w:spacing w:after="0" w:line="240"/>
+              <w:jc w:val="center"/>
+            </w:pPr>
+            <w:r>
+              <w:rPr>
+                <w:rFonts w:ascii="Times New Roman" w:cs="Times New Roman" w:eastAsia="Times New Roman" w:hAnsi="Times New Roman"/>
+                <w:sz w:val="24"/>
+                <w:szCs w:val="24"/>
+              </w:rPr>
               <w:t xml:space="preserve">Служба клиентского сервиса</w:t>
-            </w:r>
-          </w:p>
-        </w:tc>
-        <w:tc>
-          <w:tcPr>
-            <w:tcW w:type="dxa" w:w="1755"/>
-            <w:tcMar>
-              <w:top w:type="dxa" w:w="60"/>
-              <w:left w:type="dxa" w:w="80"/>
-              <w:bottom w:type="dxa" w:w="60"/>
-              <w:right w:type="dxa" w:w="80"/>
-            </w:tcMar>
-            <w:vAlign w:val="center"/>
-          </w:tcPr>
-          <w:p>
-            <w:pPr>
-              <w:spacing w:after="0" w:line="240"/>
-              <w:jc w:val="center"/>
-            </w:pPr>
-            <w:r>
-              <w:rPr>
-                <w:rFonts w:ascii="Times New Roman" w:cs="Times New Roman" w:eastAsia="Times New Roman" w:hAnsi="Times New Roman"/>
-                <w:sz w:val="24"/>
-                <w:szCs w:val="24"/>
-              </w:rPr>
-              <w:t xml:space="preserve">Руководитель проекта</w:t>
             </w:r>
           </w:p>
         </w:tc>
@@ -2462,7 +2462,7 @@
                 <w:sz w:val="24"/>
                 <w:szCs w:val="24"/>
               </w:rPr>
-              <w:t xml:space="preserve">Проводить мониторирование количества проведенных исследований ЦОГ, доли успешных анализов фотографий и обращений в службу поддержки</w:t>
+              <w:t xml:space="preserve">Подготовить скрипт о возможности прохождения ЦОГ в клинике</w:t>
             </w:r>
           </w:p>
         </w:tc>
@@ -2488,35 +2488,7 @@
                 <w:sz w:val="24"/>
                 <w:szCs w:val="24"/>
               </w:rPr>
-              <w:t xml:space="preserve">10.11.2026</w:t>
-            </w:r>
-          </w:p>
-          <w:p>
-            <w:pPr>
-              <w:spacing w:after="0" w:line="240"/>
-              <w:jc w:val="center"/>
-            </w:pPr>
-            <w:r>
-              <w:rPr>
-                <w:rFonts w:ascii="Times New Roman" w:cs="Times New Roman" w:eastAsia="Times New Roman" w:hAnsi="Times New Roman"/>
-                <w:sz w:val="24"/>
-                <w:szCs w:val="24"/>
-              </w:rPr>
-              <w:t xml:space="preserve">10.12.2026</w:t>
-            </w:r>
-          </w:p>
-          <w:p>
-            <w:pPr>
-              <w:spacing w:after="0" w:line="240"/>
-              <w:jc w:val="center"/>
-            </w:pPr>
-            <w:r>
-              <w:rPr>
-                <w:rFonts w:ascii="Times New Roman" w:cs="Times New Roman" w:eastAsia="Times New Roman" w:hAnsi="Times New Roman"/>
-                <w:sz w:val="24"/>
-                <w:szCs w:val="24"/>
-              </w:rPr>
-              <w:t xml:space="preserve">15.01.2027</w:t>
+              <w:t xml:space="preserve">13.11.2026</w:t>
             </w:r>
           </w:p>
         </w:tc>
@@ -2542,33 +2514,33 @@
                 <w:sz w:val="24"/>
                 <w:szCs w:val="24"/>
               </w:rPr>
+              <w:t xml:space="preserve">Служба клиентского сервиса</w:t>
+            </w:r>
+          </w:p>
+        </w:tc>
+        <w:tc>
+          <w:tcPr>
+            <w:tcW w:type="dxa" w:w="1755"/>
+            <w:tcMar>
+              <w:top w:type="dxa" w:w="60"/>
+              <w:left w:type="dxa" w:w="80"/>
+              <w:bottom w:type="dxa" w:w="60"/>
+              <w:right w:type="dxa" w:w="80"/>
+            </w:tcMar>
+            <w:vAlign w:val="center"/>
+          </w:tcPr>
+          <w:p>
+            <w:pPr>
+              <w:spacing w:after="0" w:line="240"/>
+              <w:jc w:val="center"/>
+            </w:pPr>
+            <w:r>
+              <w:rPr>
+                <w:rFonts w:ascii="Times New Roman" w:cs="Times New Roman" w:eastAsia="Times New Roman" w:hAnsi="Times New Roman"/>
+                <w:sz w:val="24"/>
+                <w:szCs w:val="24"/>
+              </w:rPr>
               <w:t xml:space="preserve">Руководитель проекта</w:t>
-            </w:r>
-          </w:p>
-        </w:tc>
-        <w:tc>
-          <w:tcPr>
-            <w:tcW w:type="dxa" w:w="1755"/>
-            <w:tcMar>
-              <w:top w:type="dxa" w:w="60"/>
-              <w:left w:type="dxa" w:w="80"/>
-              <w:bottom w:type="dxa" w:w="60"/>
-              <w:right w:type="dxa" w:w="80"/>
-            </w:tcMar>
-            <w:vAlign w:val="center"/>
-          </w:tcPr>
-          <w:p>
-            <w:pPr>
-              <w:spacing w:after="0" w:line="240"/>
-              <w:jc w:val="center"/>
-            </w:pPr>
-            <w:r>
-              <w:rPr>
-                <w:rFonts w:ascii="Times New Roman" w:cs="Times New Roman" w:eastAsia="Times New Roman" w:hAnsi="Times New Roman"/>
-                <w:sz w:val="24"/>
-                <w:szCs w:val="24"/>
-              </w:rPr>
-              <w:t xml:space="preserve">Заведующий стационаром</w:t>
             </w:r>
           </w:p>
         </w:tc>
@@ -2597,6 +2569,430 @@
                 <w:szCs w:val="24"/>
               </w:rPr>
               <w:t xml:space="preserve">17.</w:t>
+            </w:r>
+          </w:p>
+        </w:tc>
+        <w:tc>
+          <w:tcPr>
+            <w:tcW w:type="dxa" w:w="3500"/>
+            <w:tcMar>
+              <w:top w:type="dxa" w:w="60"/>
+              <w:left w:type="dxa" w:w="80"/>
+              <w:bottom w:type="dxa" w:w="60"/>
+              <w:right w:type="dxa" w:w="80"/>
+            </w:tcMar>
+            <w:vAlign w:val="center"/>
+          </w:tcPr>
+          <w:p>
+            <w:pPr>
+              <w:spacing w:after="0" w:line="240"/>
+              <w:jc w:val="left"/>
+            </w:pPr>
+            <w:r>
+              <w:rPr>
+                <w:rFonts w:ascii="Times New Roman" w:cs="Times New Roman" w:eastAsia="Times New Roman" w:hAnsi="Times New Roman"/>
+                <w:sz w:val="24"/>
+                <w:szCs w:val="24"/>
+              </w:rPr>
+              <w:t xml:space="preserve">Сделать на сайте страницу с информированием о возможности прохождения ЦОГ в клинике</w:t>
+            </w:r>
+          </w:p>
+        </w:tc>
+        <w:tc>
+          <w:tcPr>
+            <w:tcW w:type="dxa" w:w="1500"/>
+            <w:tcMar>
+              <w:top w:type="dxa" w:w="60"/>
+              <w:left w:type="dxa" w:w="80"/>
+              <w:bottom w:type="dxa" w:w="60"/>
+              <w:right w:type="dxa" w:w="80"/>
+            </w:tcMar>
+            <w:vAlign w:val="center"/>
+          </w:tcPr>
+          <w:p>
+            <w:pPr>
+              <w:spacing w:after="0" w:line="240"/>
+              <w:jc w:val="center"/>
+            </w:pPr>
+            <w:r>
+              <w:rPr>
+                <w:rFonts w:ascii="Times New Roman" w:cs="Times New Roman" w:eastAsia="Times New Roman" w:hAnsi="Times New Roman"/>
+                <w:sz w:val="24"/>
+                <w:szCs w:val="24"/>
+              </w:rPr>
+              <w:t xml:space="preserve">20.11.2026</w:t>
+            </w:r>
+          </w:p>
+        </w:tc>
+        <w:tc>
+          <w:tcPr>
+            <w:tcW w:type="dxa" w:w="1900"/>
+            <w:tcMar>
+              <w:top w:type="dxa" w:w="60"/>
+              <w:left w:type="dxa" w:w="80"/>
+              <w:bottom w:type="dxa" w:w="60"/>
+              <w:right w:type="dxa" w:w="80"/>
+            </w:tcMar>
+            <w:vAlign w:val="center"/>
+          </w:tcPr>
+          <w:p>
+            <w:pPr>
+              <w:spacing w:after="0" w:line="240"/>
+              <w:jc w:val="center"/>
+            </w:pPr>
+            <w:r>
+              <w:rPr>
+                <w:rFonts w:ascii="Times New Roman" w:cs="Times New Roman" w:eastAsia="Times New Roman" w:hAnsi="Times New Roman"/>
+                <w:sz w:val="24"/>
+                <w:szCs w:val="24"/>
+              </w:rPr>
+              <w:t xml:space="preserve">Служба маркетинга</w:t>
+            </w:r>
+          </w:p>
+        </w:tc>
+        <w:tc>
+          <w:tcPr>
+            <w:tcW w:type="dxa" w:w="1755"/>
+            <w:tcMar>
+              <w:top w:type="dxa" w:w="60"/>
+              <w:left w:type="dxa" w:w="80"/>
+              <w:bottom w:type="dxa" w:w="60"/>
+              <w:right w:type="dxa" w:w="80"/>
+            </w:tcMar>
+            <w:vAlign w:val="center"/>
+          </w:tcPr>
+          <w:p>
+            <w:pPr>
+              <w:spacing w:after="0" w:line="240"/>
+              <w:jc w:val="center"/>
+            </w:pPr>
+            <w:r>
+              <w:rPr>
+                <w:rFonts w:ascii="Times New Roman" w:cs="Times New Roman" w:eastAsia="Times New Roman" w:hAnsi="Times New Roman"/>
+                <w:sz w:val="24"/>
+                <w:szCs w:val="24"/>
+              </w:rPr>
+              <w:t xml:space="preserve">Руководитель проекта</w:t>
+            </w:r>
+          </w:p>
+        </w:tc>
+      </w:tr>
+      <w:tr>
+        <w:tc>
+          <w:tcPr>
+            <w:tcW w:type="dxa" w:w="700"/>
+            <w:tcMar>
+              <w:top w:type="dxa" w:w="60"/>
+              <w:left w:type="dxa" w:w="80"/>
+              <w:bottom w:type="dxa" w:w="60"/>
+              <w:right w:type="dxa" w:w="80"/>
+            </w:tcMar>
+            <w:vAlign w:val="center"/>
+          </w:tcPr>
+          <w:p>
+            <w:pPr>
+              <w:spacing w:after="0" w:line="240"/>
+              <w:jc w:val="center"/>
+            </w:pPr>
+            <w:r>
+              <w:rPr>
+                <w:rFonts w:ascii="Times New Roman" w:cs="Times New Roman" w:eastAsia="Times New Roman" w:hAnsi="Times New Roman"/>
+                <w:sz w:val="24"/>
+                <w:szCs w:val="24"/>
+              </w:rPr>
+              <w:t xml:space="preserve">18.</w:t>
+            </w:r>
+          </w:p>
+        </w:tc>
+        <w:tc>
+          <w:tcPr>
+            <w:tcW w:type="dxa" w:w="3500"/>
+            <w:tcMar>
+              <w:top w:type="dxa" w:w="60"/>
+              <w:left w:type="dxa" w:w="80"/>
+              <w:bottom w:type="dxa" w:w="60"/>
+              <w:right w:type="dxa" w:w="80"/>
+            </w:tcMar>
+            <w:vAlign w:val="center"/>
+          </w:tcPr>
+          <w:p>
+            <w:pPr>
+              <w:spacing w:after="0" w:line="240"/>
+              <w:jc w:val="left"/>
+            </w:pPr>
+            <w:r>
+              <w:rPr>
+                <w:rFonts w:ascii="Times New Roman" w:cs="Times New Roman" w:eastAsia="Times New Roman" w:hAnsi="Times New Roman"/>
+                <w:sz w:val="24"/>
+                <w:szCs w:val="24"/>
+              </w:rPr>
+              <w:t xml:space="preserve">Провести клиническую валидацию методики: сопоставить результат индекса Z с очной оценкой врача не менее чем у 30 пациентов, при расхождениях направить замечания для доработки алгоритма</w:t>
+            </w:r>
+          </w:p>
+        </w:tc>
+        <w:tc>
+          <w:tcPr>
+            <w:tcW w:type="dxa" w:w="1500"/>
+            <w:tcMar>
+              <w:top w:type="dxa" w:w="60"/>
+              <w:left w:type="dxa" w:w="80"/>
+              <w:bottom w:type="dxa" w:w="60"/>
+              <w:right w:type="dxa" w:w="80"/>
+            </w:tcMar>
+            <w:vAlign w:val="center"/>
+          </w:tcPr>
+          <w:p>
+            <w:pPr>
+              <w:spacing w:after="0" w:line="240"/>
+              <w:jc w:val="center"/>
+            </w:pPr>
+            <w:r>
+              <w:rPr>
+                <w:rFonts w:ascii="Times New Roman" w:cs="Times New Roman" w:eastAsia="Times New Roman" w:hAnsi="Times New Roman"/>
+                <w:sz w:val="24"/>
+                <w:szCs w:val="24"/>
+              </w:rPr>
+              <w:t xml:space="preserve">27.11.2026</w:t>
+            </w:r>
+          </w:p>
+        </w:tc>
+        <w:tc>
+          <w:tcPr>
+            <w:tcW w:type="dxa" w:w="1900"/>
+            <w:tcMar>
+              <w:top w:type="dxa" w:w="60"/>
+              <w:left w:type="dxa" w:w="80"/>
+              <w:bottom w:type="dxa" w:w="60"/>
+              <w:right w:type="dxa" w:w="80"/>
+            </w:tcMar>
+            <w:vAlign w:val="center"/>
+          </w:tcPr>
+          <w:p>
+            <w:pPr>
+              <w:spacing w:after="0" w:line="240"/>
+              <w:jc w:val="center"/>
+            </w:pPr>
+            <w:r>
+              <w:rPr>
+                <w:rFonts w:ascii="Times New Roman" w:cs="Times New Roman" w:eastAsia="Times New Roman" w:hAnsi="Times New Roman"/>
+                <w:sz w:val="24"/>
+                <w:szCs w:val="24"/>
+              </w:rPr>
+              <w:t xml:space="preserve">Заведующий отделением стоматологии</w:t>
+            </w:r>
+          </w:p>
+        </w:tc>
+        <w:tc>
+          <w:tcPr>
+            <w:tcW w:type="dxa" w:w="1755"/>
+            <w:tcMar>
+              <w:top w:type="dxa" w:w="60"/>
+              <w:left w:type="dxa" w:w="80"/>
+              <w:bottom w:type="dxa" w:w="60"/>
+              <w:right w:type="dxa" w:w="80"/>
+            </w:tcMar>
+            <w:vAlign w:val="center"/>
+          </w:tcPr>
+          <w:p>
+            <w:pPr>
+              <w:spacing w:after="0" w:line="240"/>
+              <w:jc w:val="center"/>
+            </w:pPr>
+            <w:r>
+              <w:rPr>
+                <w:rFonts w:ascii="Times New Roman" w:cs="Times New Roman" w:eastAsia="Times New Roman" w:hAnsi="Times New Roman"/>
+                <w:sz w:val="24"/>
+                <w:szCs w:val="24"/>
+              </w:rPr>
+              <w:t xml:space="preserve">Руководитель проекта</w:t>
+            </w:r>
+          </w:p>
+        </w:tc>
+      </w:tr>
+      <w:tr>
+        <w:tc>
+          <w:tcPr>
+            <w:tcW w:type="dxa" w:w="700"/>
+            <w:tcMar>
+              <w:top w:type="dxa" w:w="60"/>
+              <w:left w:type="dxa" w:w="80"/>
+              <w:bottom w:type="dxa" w:w="60"/>
+              <w:right w:type="dxa" w:w="80"/>
+            </w:tcMar>
+            <w:vAlign w:val="center"/>
+          </w:tcPr>
+          <w:p>
+            <w:pPr>
+              <w:spacing w:after="0" w:line="240"/>
+              <w:jc w:val="center"/>
+            </w:pPr>
+            <w:r>
+              <w:rPr>
+                <w:rFonts w:ascii="Times New Roman" w:cs="Times New Roman" w:eastAsia="Times New Roman" w:hAnsi="Times New Roman"/>
+                <w:sz w:val="24"/>
+                <w:szCs w:val="24"/>
+              </w:rPr>
+              <w:t xml:space="preserve">19.</w:t>
+            </w:r>
+          </w:p>
+        </w:tc>
+        <w:tc>
+          <w:tcPr>
+            <w:tcW w:type="dxa" w:w="3500"/>
+            <w:tcMar>
+              <w:top w:type="dxa" w:w="60"/>
+              <w:left w:type="dxa" w:w="80"/>
+              <w:bottom w:type="dxa" w:w="60"/>
+              <w:right w:type="dxa" w:w="80"/>
+            </w:tcMar>
+            <w:vAlign w:val="center"/>
+          </w:tcPr>
+          <w:p>
+            <w:pPr>
+              <w:spacing w:after="0" w:line="240"/>
+              <w:jc w:val="left"/>
+            </w:pPr>
+            <w:r>
+              <w:rPr>
+                <w:rFonts w:ascii="Times New Roman" w:cs="Times New Roman" w:eastAsia="Times New Roman" w:hAnsi="Times New Roman"/>
+                <w:sz w:val="24"/>
+                <w:szCs w:val="24"/>
+              </w:rPr>
+              <w:t xml:space="preserve">Проводить мониторирование количества проведенных исследований ЦОГ, доли фотографий, отклоненных при автоматической проверке, среднего времени анализа и затрат на ИИ-обработку</w:t>
+            </w:r>
+          </w:p>
+        </w:tc>
+        <w:tc>
+          <w:tcPr>
+            <w:tcW w:type="dxa" w:w="1500"/>
+            <w:tcMar>
+              <w:top w:type="dxa" w:w="60"/>
+              <w:left w:type="dxa" w:w="80"/>
+              <w:bottom w:type="dxa" w:w="60"/>
+              <w:right w:type="dxa" w:w="80"/>
+            </w:tcMar>
+            <w:vAlign w:val="center"/>
+          </w:tcPr>
+          <w:p>
+            <w:pPr>
+              <w:spacing w:after="0" w:line="240"/>
+              <w:jc w:val="center"/>
+            </w:pPr>
+            <w:r>
+              <w:rPr>
+                <w:rFonts w:ascii="Times New Roman" w:cs="Times New Roman" w:eastAsia="Times New Roman" w:hAnsi="Times New Roman"/>
+                <w:sz w:val="24"/>
+                <w:szCs w:val="24"/>
+              </w:rPr>
+              <w:t xml:space="preserve">10.11.2026</w:t>
+            </w:r>
+          </w:p>
+          <w:p>
+            <w:pPr>
+              <w:spacing w:after="0" w:line="240"/>
+              <w:jc w:val="center"/>
+            </w:pPr>
+            <w:r>
+              <w:rPr>
+                <w:rFonts w:ascii="Times New Roman" w:cs="Times New Roman" w:eastAsia="Times New Roman" w:hAnsi="Times New Roman"/>
+                <w:sz w:val="24"/>
+                <w:szCs w:val="24"/>
+              </w:rPr>
+              <w:t xml:space="preserve">10.12.2026</w:t>
+            </w:r>
+          </w:p>
+          <w:p>
+            <w:pPr>
+              <w:spacing w:after="0" w:line="240"/>
+              <w:jc w:val="center"/>
+            </w:pPr>
+            <w:r>
+              <w:rPr>
+                <w:rFonts w:ascii="Times New Roman" w:cs="Times New Roman" w:eastAsia="Times New Roman" w:hAnsi="Times New Roman"/>
+                <w:sz w:val="24"/>
+                <w:szCs w:val="24"/>
+              </w:rPr>
+              <w:t xml:space="preserve">15.01.2027</w:t>
+            </w:r>
+          </w:p>
+        </w:tc>
+        <w:tc>
+          <w:tcPr>
+            <w:tcW w:type="dxa" w:w="1900"/>
+            <w:tcMar>
+              <w:top w:type="dxa" w:w="60"/>
+              <w:left w:type="dxa" w:w="80"/>
+              <w:bottom w:type="dxa" w:w="60"/>
+              <w:right w:type="dxa" w:w="80"/>
+            </w:tcMar>
+            <w:vAlign w:val="center"/>
+          </w:tcPr>
+          <w:p>
+            <w:pPr>
+              <w:spacing w:after="0" w:line="240"/>
+              <w:jc w:val="center"/>
+            </w:pPr>
+            <w:r>
+              <w:rPr>
+                <w:rFonts w:ascii="Times New Roman" w:cs="Times New Roman" w:eastAsia="Times New Roman" w:hAnsi="Times New Roman"/>
+                <w:sz w:val="24"/>
+                <w:szCs w:val="24"/>
+              </w:rPr>
+              <w:t xml:space="preserve">Руководитель проекта</w:t>
+            </w:r>
+          </w:p>
+        </w:tc>
+        <w:tc>
+          <w:tcPr>
+            <w:tcW w:type="dxa" w:w="1755"/>
+            <w:tcMar>
+              <w:top w:type="dxa" w:w="60"/>
+              <w:left w:type="dxa" w:w="80"/>
+              <w:bottom w:type="dxa" w:w="60"/>
+              <w:right w:type="dxa" w:w="80"/>
+            </w:tcMar>
+            <w:vAlign w:val="center"/>
+          </w:tcPr>
+          <w:p>
+            <w:pPr>
+              <w:spacing w:after="0" w:line="240"/>
+              <w:jc w:val="center"/>
+            </w:pPr>
+            <w:r>
+              <w:rPr>
+                <w:rFonts w:ascii="Times New Roman" w:cs="Times New Roman" w:eastAsia="Times New Roman" w:hAnsi="Times New Roman"/>
+                <w:sz w:val="24"/>
+                <w:szCs w:val="24"/>
+              </w:rPr>
+              <w:t xml:space="preserve">Заведующий стационаром</w:t>
+            </w:r>
+          </w:p>
+        </w:tc>
+      </w:tr>
+      <w:tr>
+        <w:tc>
+          <w:tcPr>
+            <w:tcW w:type="dxa" w:w="700"/>
+            <w:tcMar>
+              <w:top w:type="dxa" w:w="60"/>
+              <w:left w:type="dxa" w:w="80"/>
+              <w:bottom w:type="dxa" w:w="60"/>
+              <w:right w:type="dxa" w:w="80"/>
+            </w:tcMar>
+            <w:vAlign w:val="center"/>
+          </w:tcPr>
+          <w:p>
+            <w:pPr>
+              <w:spacing w:after="0" w:line="240"/>
+              <w:jc w:val="center"/>
+            </w:pPr>
+            <w:r>
+              <w:rPr>
+                <w:rFonts w:ascii="Times New Roman" w:cs="Times New Roman" w:eastAsia="Times New Roman" w:hAnsi="Times New Roman"/>
+                <w:sz w:val="24"/>
+                <w:szCs w:val="24"/>
+              </w:rPr>
+              <w:t xml:space="preserve">20.</w:t>
             </w:r>
           </w:p>
         </w:tc>

</xml_diff>